<commit_message>
Validaciones de registro de productos
</commit_message>
<xml_diff>
--- a/Archivos/Sources/MockUps.docx
+++ b/Archivos/Sources/MockUps.docx
@@ -61,18 +61,20 @@
     </w:p>
     <w:p>
       <w:pPr>
+        <w:jc w:val="center"/>
         <w:rPr>
           <w:lang w:val="es-ES"/>
         </w:rPr>
       </w:pPr>
       <w:r>
         <w:rPr>
+          <w:noProof/>
           <w:lang w:val="es-ES"/>
         </w:rPr>
         <w:drawing>
-          <wp:inline distT="0" distB="0" distL="0" distR="0" wp14:anchorId="5CFC344D" wp14:editId="1F86A87A">
-            <wp:extent cx="5400040" cy="4319905"/>
-            <wp:effectExtent l="0" t="0" r="0" b="4445"/>
+          <wp:inline distT="0" distB="0" distL="0" distR="0" wp14:anchorId="5CFC344D" wp14:editId="6A42D8A1">
+            <wp:extent cx="5143651" cy="4114800"/>
+            <wp:effectExtent l="0" t="0" r="0" b="0"/>
             <wp:docPr id="207122853" name="Imagen 1"/>
             <wp:cNvGraphicFramePr>
               <a:graphicFrameLocks xmlns:a="http://schemas.openxmlformats.org/drawingml/2006/main" noChangeAspect="1"/>
@@ -93,7 +95,7 @@
                   <pic:spPr>
                     <a:xfrm>
                       <a:off x="0" y="0"/>
-                      <a:ext cx="5400040" cy="4319905"/>
+                      <a:ext cx="5144216" cy="4115252"/>
                     </a:xfrm>
                     <a:prstGeom prst="rect">
                       <a:avLst/>
@@ -112,6 +114,155 @@
           <w:lang w:val="es-ES"/>
         </w:rPr>
       </w:pPr>
+    </w:p>
+    <w:p>
+      <w:pPr>
+        <w:rPr>
+          <w:lang w:val="es-ES"/>
+        </w:rPr>
+      </w:pPr>
+      <w:r>
+        <w:rPr>
+          <w:lang w:val="es-ES"/>
+        </w:rPr>
+        <w:t xml:space="preserve">HU2.formulario </w:t>
+      </w:r>
+    </w:p>
+    <w:p>
+      <w:pPr>
+        <w:rPr>
+          <w:lang w:val="en-US"/>
+        </w:rPr>
+      </w:pPr>
+      <w:r>
+        <w:rPr>
+          <w:lang w:val="en-US"/>
+        </w:rPr>
+        <w:drawing>
+          <wp:inline distT="0" distB="0" distL="0" distR="0" wp14:anchorId="6D8C4245" wp14:editId="66D31F6F">
+            <wp:extent cx="4986361" cy="3178629"/>
+            <wp:effectExtent l="0" t="0" r="5080" b="3175"/>
+            <wp:docPr id="1926823055" name="Imagen 1"/>
+            <wp:cNvGraphicFramePr>
+              <a:graphicFrameLocks xmlns:a="http://schemas.openxmlformats.org/drawingml/2006/main" noChangeAspect="1"/>
+            </wp:cNvGraphicFramePr>
+            <a:graphic xmlns:a="http://schemas.openxmlformats.org/drawingml/2006/main">
+              <a:graphicData uri="http://schemas.openxmlformats.org/drawingml/2006/picture">
+                <pic:pic xmlns:pic="http://schemas.openxmlformats.org/drawingml/2006/picture">
+                  <pic:nvPicPr>
+                    <pic:cNvPr id="1926823055" name=""/>
+                    <pic:cNvPicPr/>
+                  </pic:nvPicPr>
+                  <pic:blipFill>
+                    <a:blip r:embed="rId5"/>
+                    <a:stretch>
+                      <a:fillRect/>
+                    </a:stretch>
+                  </pic:blipFill>
+                  <pic:spPr>
+                    <a:xfrm>
+                      <a:off x="0" y="0"/>
+                      <a:ext cx="4988376" cy="3179913"/>
+                    </a:xfrm>
+                    <a:prstGeom prst="rect">
+                      <a:avLst/>
+                    </a:prstGeom>
+                  </pic:spPr>
+                </pic:pic>
+              </a:graphicData>
+            </a:graphic>
+          </wp:inline>
+        </w:drawing>
+      </w:r>
+    </w:p>
+    <w:p>
+      <w:pPr>
+        <w:rPr>
+          <w:lang w:val="en-US"/>
+        </w:rPr>
+      </w:pPr>
+    </w:p>
+    <w:p>
+      <w:pPr>
+        <w:rPr>
+          <w:lang w:val="en-US"/>
+        </w:rPr>
+      </w:pPr>
+      <w:r>
+        <w:rPr>
+          <w:lang w:val="en-US"/>
+        </w:rPr>
+        <w:lastRenderedPageBreak/>
+        <w:t xml:space="preserve">HU – 07 Registrar </w:t>
+      </w:r>
+      <w:proofErr w:type="spellStart"/>
+      <w:r>
+        <w:rPr>
+          <w:lang w:val="en-US"/>
+        </w:rPr>
+        <w:t>Prodcuto</w:t>
+      </w:r>
+      <w:proofErr w:type="spellEnd"/>
+      <w:r>
+        <w:rPr>
+          <w:lang w:val="en-US"/>
+        </w:rPr>
+        <w:t xml:space="preserve"> </w:t>
+      </w:r>
+    </w:p>
+    <w:p>
+      <w:pPr>
+        <w:rPr>
+          <w:lang w:val="en-US"/>
+        </w:rPr>
+      </w:pPr>
+    </w:p>
+    <w:p>
+      <w:pPr>
+        <w:rPr>
+          <w:lang w:val="en-US"/>
+        </w:rPr>
+      </w:pPr>
+      <w:r>
+        <w:rPr>
+          <w:lang w:val="en-US"/>
+        </w:rPr>
+        <w:drawing>
+          <wp:inline distT="0" distB="0" distL="0" distR="0" wp14:anchorId="4E60B925" wp14:editId="24C8657F">
+            <wp:extent cx="5400040" cy="5315585"/>
+            <wp:effectExtent l="0" t="0" r="0" b="0"/>
+            <wp:docPr id="626967301" name="Imagen 1"/>
+            <wp:cNvGraphicFramePr>
+              <a:graphicFrameLocks xmlns:a="http://schemas.openxmlformats.org/drawingml/2006/main" noChangeAspect="1"/>
+            </wp:cNvGraphicFramePr>
+            <a:graphic xmlns:a="http://schemas.openxmlformats.org/drawingml/2006/main">
+              <a:graphicData uri="http://schemas.openxmlformats.org/drawingml/2006/picture">
+                <pic:pic xmlns:pic="http://schemas.openxmlformats.org/drawingml/2006/picture">
+                  <pic:nvPicPr>
+                    <pic:cNvPr id="626967301" name=""/>
+                    <pic:cNvPicPr/>
+                  </pic:nvPicPr>
+                  <pic:blipFill>
+                    <a:blip r:embed="rId6"/>
+                    <a:stretch>
+                      <a:fillRect/>
+                    </a:stretch>
+                  </pic:blipFill>
+                  <pic:spPr>
+                    <a:xfrm>
+                      <a:off x="0" y="0"/>
+                      <a:ext cx="5400040" cy="5315585"/>
+                    </a:xfrm>
+                    <a:prstGeom prst="rect">
+                      <a:avLst/>
+                    </a:prstGeom>
+                  </pic:spPr>
+                </pic:pic>
+              </a:graphicData>
+            </a:graphic>
+          </wp:inline>
+        </w:drawing>
+      </w:r>
     </w:p>
     <w:sectPr>
       <w:pgSz w:w="11906" w:h="16838"/>

</xml_diff>